<commit_message>
Revert "feat: implement sample project seeding script and add interactive landing page with document preview functionality"
This reverts commit 47ba034ffc745b2f470f815fa48ef1893bfb0191.
</commit_message>
<xml_diff>
--- a/backend/beta/static/sample_report.docx
+++ b/backend/beta/static/sample_report.docx
@@ -125,7 +125,7 @@
           <w:rFonts w:ascii="Arial" w:hAnsi="Arial"/>
           <w:sz w:val="24"/>
         </w:rPr>
-        <w:t>Date Created: 05/03/2026</w:t>
+        <w:t>Date Created: 02/12/2026</w:t>
       </w:r>
     </w:p>
     <w:tbl>
@@ -338,7 +338,7 @@
             <w:r>
               <w:drawing>
                 <wp:inline xmlns:a="http://schemas.openxmlformats.org/drawingml/2006/main" xmlns:pic="http://schemas.openxmlformats.org/drawingml/2006/picture">
-                  <wp:extent cx="2651760" cy="1619364"/>
+                  <wp:extent cx="2651760" cy="1665798"/>
                   <wp:docPr id="1" name="Picture 1"/>
                   <wp:cNvGraphicFramePr>
                     <a:graphicFrameLocks noChangeAspect="1"/>
@@ -347,7 +347,7 @@
                     <a:graphicData uri="http://schemas.openxmlformats.org/drawingml/2006/picture">
                       <pic:pic>
                         <pic:nvPicPr>
-                          <pic:cNvPr id="0" name="69f7521a9e7de9583e2ec20e_system_context.png"/>
+                          <pic:cNvPr id="0" name="698d97a90b145fd7681180da_system_context.png"/>
                           <pic:cNvPicPr/>
                         </pic:nvPicPr>
                         <pic:blipFill>
@@ -359,7 +359,7 @@
                         <pic:spPr>
                           <a:xfrm>
                             <a:off x="0" y="0"/>
-                            <a:ext cx="2651760" cy="1619364"/>
+                            <a:ext cx="2651760" cy="1665798"/>
                           </a:xfrm>
                           <a:prstGeom prst="rect"/>
                         </pic:spPr>
@@ -391,7 +391,7 @@
             <w:r>
               <w:drawing>
                 <wp:inline xmlns:a="http://schemas.openxmlformats.org/drawingml/2006/main" xmlns:pic="http://schemas.openxmlformats.org/drawingml/2006/picture">
-                  <wp:extent cx="2651760" cy="1672237"/>
+                  <wp:extent cx="2651760" cy="2085184"/>
                   <wp:docPr id="2" name="Picture 2"/>
                   <wp:cNvGraphicFramePr>
                     <a:graphicFrameLocks noChangeAspect="1"/>
@@ -400,7 +400,7 @@
                     <a:graphicData uri="http://schemas.openxmlformats.org/drawingml/2006/picture">
                       <pic:pic>
                         <pic:nvPicPr>
-                          <pic:cNvPr id="0" name="69f7521a9e7de9583e2ec20e_system_architecture.png"/>
+                          <pic:cNvPr id="0" name="698d97a90b145fd7681180da_system_architecture.png"/>
                           <pic:cNvPicPr/>
                         </pic:nvPicPr>
                         <pic:blipFill>
@@ -412,7 +412,7 @@
                         <pic:spPr>
                           <a:xfrm>
                             <a:off x="0" y="0"/>
-                            <a:ext cx="2651760" cy="1672237"/>
+                            <a:ext cx="2651760" cy="2085184"/>
                           </a:xfrm>
                           <a:prstGeom prst="rect"/>
                         </pic:spPr>
@@ -446,7 +446,7 @@
             <w:r>
               <w:drawing>
                 <wp:inline xmlns:a="http://schemas.openxmlformats.org/drawingml/2006/main" xmlns:pic="http://schemas.openxmlformats.org/drawingml/2006/picture">
-                  <wp:extent cx="2651760" cy="801828"/>
+                  <wp:extent cx="2651760" cy="719284"/>
                   <wp:docPr id="3" name="Picture 3"/>
                   <wp:cNvGraphicFramePr>
                     <a:graphicFrameLocks noChangeAspect="1"/>
@@ -455,7 +455,7 @@
                     <a:graphicData uri="http://schemas.openxmlformats.org/drawingml/2006/picture">
                       <pic:pic>
                         <pic:nvPicPr>
-                          <pic:cNvPr id="0" name="69f7521a9e7de9583e2ec20e_use_case.png"/>
+                          <pic:cNvPr id="0" name="698d97a90b145fd7681180da_use_case.png"/>
                           <pic:cNvPicPr/>
                         </pic:nvPicPr>
                         <pic:blipFill>
@@ -467,7 +467,7 @@
                         <pic:spPr>
                           <a:xfrm>
                             <a:off x="0" y="0"/>
-                            <a:ext cx="2651760" cy="801828"/>
+                            <a:ext cx="2651760" cy="719284"/>
                           </a:xfrm>
                           <a:prstGeom prst="rect"/>
                         </pic:spPr>
@@ -508,7 +508,7 @@
                     <a:graphicData uri="http://schemas.openxmlformats.org/drawingml/2006/picture">
                       <pic:pic>
                         <pic:nvPicPr>
-                          <pic:cNvPr id="0" name="69f7521a9e7de9583e2ec20e_user_workflow.png"/>
+                          <pic:cNvPr id="0" name="698d97a90b145fd7681180da_user_workflow.png"/>
                           <pic:cNvPicPr/>
                         </pic:nvPicPr>
                         <pic:blipFill>
@@ -554,7 +554,7 @@
             <w:r>
               <w:drawing>
                 <wp:inline xmlns:a="http://schemas.openxmlformats.org/drawingml/2006/main" xmlns:pic="http://schemas.openxmlformats.org/drawingml/2006/picture">
-                  <wp:extent cx="2651760" cy="236559"/>
+                  <wp:extent cx="2651760" cy="237990"/>
                   <wp:docPr id="5" name="Picture 5"/>
                   <wp:cNvGraphicFramePr>
                     <a:graphicFrameLocks noChangeAspect="1"/>
@@ -563,7 +563,7 @@
                     <a:graphicData uri="http://schemas.openxmlformats.org/drawingml/2006/picture">
                       <pic:pic>
                         <pic:nvPicPr>
-                          <pic:cNvPr id="0" name="69f7521a9e7de9583e2ec20e_security_flow.png"/>
+                          <pic:cNvPr id="0" name="698d97a90b145fd7681180da_security_flow.png"/>
                           <pic:cNvPicPr/>
                         </pic:nvPicPr>
                         <pic:blipFill>
@@ -575,7 +575,7 @@
                         <pic:spPr>
                           <a:xfrm>
                             <a:off x="0" y="0"/>
-                            <a:ext cx="2651760" cy="236559"/>
+                            <a:ext cx="2651760" cy="237990"/>
                           </a:xfrm>
                           <a:prstGeom prst="rect"/>
                         </pic:spPr>
@@ -616,7 +616,7 @@
                     <a:graphicData uri="http://schemas.openxmlformats.org/drawingml/2006/picture">
                       <pic:pic>
                         <pic:nvPicPr>
-                          <pic:cNvPr id="0" name="69f7521a9e7de9583e2ec20e_data_erd.png"/>
+                          <pic:cNvPr id="0" name="698d97a90b145fd7681180da_data_erd.png"/>
                           <pic:cNvPicPr/>
                         </pic:nvPicPr>
                         <pic:blipFill>
@@ -668,7 +668,7 @@
     </w:p>
     <w:p>
       <w:r>
-        <w:t>No problem statement provided. This SRS defines a structured Web Application solution that centralizes core operations, standardizes workflows, improves data quality, and supports auditable execution across key departments. The platform is designed for maintainability, secure role-based access, and progressive enhancement as usage scales.</w:t>
+        <w:t>No problem statement provided.</w:t>
       </w:r>
     </w:p>
     <w:p>
@@ -681,7 +681,7 @@
     </w:p>
     <w:p>
       <w:r>
-        <w:t>The solution delivers a centralized General platform with secure user access, modular service boundaries, measurable SLAs, and operational reporting. It includes business process automation, data governance controls, and API-ready integration support. Items that are not explicitly listed in this specification remain out of scope for the current release.</w:t>
+        <w:t>The system provides a centralized platform for General operations with secure access, reporting, and monitoring. Features outside the specified requirements are excluded.</w:t>
       </w:r>
     </w:p>
     <w:p>
@@ -698,38 +698,6 @@
       </w:pPr>
       <w:r>
         <w:t>Default Feature</w:t>
-      </w:r>
-    </w:p>
-    <w:p>
-      <w:pPr>
-        <w:pStyle w:val="Heading3"/>
-      </w:pPr>
-      <w:r>
-        <w:t>Excluded from scope:</w:t>
-      </w:r>
-    </w:p>
-    <w:p>
-      <w:pPr>
-        <w:pStyle w:val="ListBullet"/>
-      </w:pPr>
-      <w:r>
-        <w:t>Direct replacement of unrelated legacy tools outside defined domain boundaries</w:t>
-      </w:r>
-    </w:p>
-    <w:p>
-      <w:pPr>
-        <w:pStyle w:val="ListBullet"/>
-      </w:pPr>
-      <w:r>
-        <w:t>Custom integrations not listed in technical preferences</w:t>
-      </w:r>
-    </w:p>
-    <w:p>
-      <w:pPr>
-        <w:pStyle w:val="ListBullet"/>
-      </w:pPr>
-      <w:r>
-        <w:t>Unapproved feature expansions outside the release objective</w:t>
       </w:r>
     </w:p>
     <w:p>
@@ -948,7 +916,7 @@
     </w:p>
     <w:p>
       <w:r>
-        <w:t>The product is a Web Application platform operating in the General domain. It serves as a unified control point for business workflows, combining secure identity, transaction lifecycle handling, reporting, and integration readiness. The architecture is designed to support phased rollout, future scaling, and clear separation between UI, service, and data concerns.</w:t>
+        <w:t>Web Application in the General domain. No problem statement provided.</w:t>
       </w:r>
     </w:p>
     <w:tbl>
@@ -973,7 +941,7 @@
             <w:r>
               <w:drawing>
                 <wp:inline xmlns:a="http://schemas.openxmlformats.org/drawingml/2006/main" xmlns:pic="http://schemas.openxmlformats.org/drawingml/2006/picture">
-                  <wp:extent cx="5303520" cy="3238728"/>
+                  <wp:extent cx="5303520" cy="3331596"/>
                   <wp:docPr id="7" name="Picture 7"/>
                   <wp:cNvGraphicFramePr>
                     <a:graphicFrameLocks noChangeAspect="1"/>
@@ -982,7 +950,7 @@
                     <a:graphicData uri="http://schemas.openxmlformats.org/drawingml/2006/picture">
                       <pic:pic>
                         <pic:nvPicPr>
-                          <pic:cNvPr id="0" name="69f7521a9e7de9583e2ec20e_system_context.png"/>
+                          <pic:cNvPr id="0" name="698d97a90b145fd7681180da_system_context.png"/>
                           <pic:cNvPicPr/>
                         </pic:nvPicPr>
                         <pic:blipFill>
@@ -994,7 +962,7 @@
                         <pic:spPr>
                           <a:xfrm>
                             <a:off x="0" y="0"/>
-                            <a:ext cx="5303520" cy="3238728"/>
+                            <a:ext cx="5303520" cy="3331596"/>
                           </a:xfrm>
                           <a:prstGeom prst="rect"/>
                         </pic:spPr>
@@ -1050,7 +1018,7 @@
         <w:pStyle w:val="ListBullet"/>
       </w:pPr>
       <w:r>
-        <w:t>End User: Uses role-specific modules and dashboards relevant to assigned responsibilities.</w:t>
+        <w:t>End User</w:t>
       </w:r>
     </w:p>
     <w:p>
@@ -1066,23 +1034,7 @@
         <w:pStyle w:val="ListBullet"/>
       </w:pPr>
       <w:r>
-        <w:t>Modern web browsers (Chrome, Edge, Firefox)</w:t>
-      </w:r>
-    </w:p>
-    <w:p>
-      <w:pPr>
-        <w:pStyle w:val="ListBullet"/>
-      </w:pPr>
-      <w:r>
-        <w:t>Containerized API services with managed cloud runtime</w:t>
-      </w:r>
-    </w:p>
-    <w:p>
-      <w:pPr>
-        <w:pStyle w:val="ListBullet"/>
-      </w:pPr>
-      <w:r>
-        <w:t>Managed database service with backup and monitoring</w:t>
+        <w:t>Standard web/server environment</w:t>
       </w:r>
     </w:p>
     <w:p>
@@ -1091,30 +1043,6 @@
       </w:pPr>
       <w:r>
         <w:t>2.5 Design and Implementation Constraints</w:t>
-      </w:r>
-    </w:p>
-    <w:p>
-      <w:pPr>
-        <w:pStyle w:val="ListBullet"/>
-      </w:pPr>
-      <w:r>
-        <w:t>All sensitive operations must be authenticated and authorized</w:t>
-      </w:r>
-    </w:p>
-    <w:p>
-      <w:pPr>
-        <w:pStyle w:val="ListBullet"/>
-      </w:pPr>
-      <w:r>
-        <w:t>APIs should remain backward compatible within the major release</w:t>
-      </w:r>
-    </w:p>
-    <w:p>
-      <w:pPr>
-        <w:pStyle w:val="ListBullet"/>
-      </w:pPr>
-      <w:r>
-        <w:t>Document generation and reporting should complete within acceptable SLA limits</w:t>
       </w:r>
     </w:p>
     <w:p>
@@ -1130,23 +1058,7 @@
         <w:pStyle w:val="ListBullet"/>
       </w:pPr>
       <w:r>
-        <w:t>Administrator setup and role configuration guide</w:t>
-      </w:r>
-    </w:p>
-    <w:p>
-      <w:pPr>
-        <w:pStyle w:val="ListBullet"/>
-      </w:pPr>
-      <w:r>
-        <w:t>Operations handbook for day-to-day usage</w:t>
-      </w:r>
-    </w:p>
-    <w:p>
-      <w:pPr>
-        <w:pStyle w:val="ListBullet"/>
-      </w:pPr>
-      <w:r>
-        <w:t>Troubleshooting and escalation reference</w:t>
+        <w:t>User manual to be provided</w:t>
       </w:r>
     </w:p>
     <w:p>
@@ -1155,54 +1067,6 @@
       </w:pPr>
       <w:r>
         <w:t>2.7 Assumptions and Dependencies</w:t>
-      </w:r>
-    </w:p>
-    <w:p>
-      <w:pPr>
-        <w:pStyle w:val="Heading3"/>
-      </w:pPr>
-      <w:r>
-        <w:t>Assumptions:</w:t>
-      </w:r>
-    </w:p>
-    <w:p>
-      <w:pPr>
-        <w:pStyle w:val="ListBullet"/>
-      </w:pPr>
-      <w:r>
-        <w:t>Stakeholders provide complete business rules and approval logic</w:t>
-      </w:r>
-    </w:p>
-    <w:p>
-      <w:pPr>
-        <w:pStyle w:val="ListBullet"/>
-      </w:pPr>
-      <w:r>
-        <w:t>Users have stable internet connectivity and modern browser support</w:t>
-      </w:r>
-    </w:p>
-    <w:p>
-      <w:pPr>
-        <w:pStyle w:val="Heading3"/>
-      </w:pPr>
-      <w:r>
-        <w:t>Dependencies:</w:t>
-      </w:r>
-    </w:p>
-    <w:p>
-      <w:pPr>
-        <w:pStyle w:val="ListBullet"/>
-      </w:pPr>
-      <w:r>
-        <w:t>Email delivery provider for notifications and review loops</w:t>
-      </w:r>
-    </w:p>
-    <w:p>
-      <w:pPr>
-        <w:pStyle w:val="ListBullet"/>
-      </w:pPr>
-      <w:r>
-        <w:t>Database availability for persistent records and audit trails</w:t>
       </w:r>
     </w:p>
     <w:p>
@@ -1240,7 +1104,7 @@
             <w:r>
               <w:drawing>
                 <wp:inline xmlns:a="http://schemas.openxmlformats.org/drawingml/2006/main" xmlns:pic="http://schemas.openxmlformats.org/drawingml/2006/picture">
-                  <wp:extent cx="5303520" cy="3344475"/>
+                  <wp:extent cx="5303520" cy="4170369"/>
                   <wp:docPr id="8" name="Picture 8"/>
                   <wp:cNvGraphicFramePr>
                     <a:graphicFrameLocks noChangeAspect="1"/>
@@ -1249,7 +1113,7 @@
                     <a:graphicData uri="http://schemas.openxmlformats.org/drawingml/2006/picture">
                       <pic:pic>
                         <pic:nvPicPr>
-                          <pic:cNvPr id="0" name="69f7521a9e7de9583e2ec20e_system_architecture.png"/>
+                          <pic:cNvPr id="0" name="698d97a90b145fd7681180da_system_architecture.png"/>
                           <pic:cNvPicPr/>
                         </pic:nvPicPr>
                         <pic:blipFill>
@@ -1261,7 +1125,7 @@
                         <pic:spPr>
                           <a:xfrm>
                             <a:off x="0" y="0"/>
-                            <a:ext cx="5303520" cy="3344475"/>
+                            <a:ext cx="5303520" cy="4170369"/>
                           </a:xfrm>
                           <a:prstGeom prst="rect"/>
                         </pic:spPr>
@@ -1318,7 +1182,7 @@
             <w:r>
               <w:drawing>
                 <wp:inline xmlns:a="http://schemas.openxmlformats.org/drawingml/2006/main" xmlns:pic="http://schemas.openxmlformats.org/drawingml/2006/picture">
-                  <wp:extent cx="5303520" cy="1603656"/>
+                  <wp:extent cx="5303520" cy="1438568"/>
                   <wp:docPr id="9" name="Picture 9"/>
                   <wp:cNvGraphicFramePr>
                     <a:graphicFrameLocks noChangeAspect="1"/>
@@ -1327,7 +1191,7 @@
                     <a:graphicData uri="http://schemas.openxmlformats.org/drawingml/2006/picture">
                       <pic:pic>
                         <pic:nvPicPr>
-                          <pic:cNvPr id="0" name="69f7521a9e7de9583e2ec20e_use_case.png"/>
+                          <pic:cNvPr id="0" name="698d97a90b145fd7681180da_use_case.png"/>
                           <pic:cNvPicPr/>
                         </pic:nvPicPr>
                         <pic:blipFill>
@@ -1339,7 +1203,7 @@
                         <pic:spPr>
                           <a:xfrm>
                             <a:off x="0" y="0"/>
-                            <a:ext cx="5303520" cy="1603656"/>
+                            <a:ext cx="5303520" cy="1438568"/>
                           </a:xfrm>
                           <a:prstGeom prst="rect"/>
                         </pic:spPr>
@@ -1439,7 +1303,7 @@
                     <a:graphicData uri="http://schemas.openxmlformats.org/drawingml/2006/picture">
                       <pic:pic>
                         <pic:nvPicPr>
-                          <pic:cNvPr id="0" name="69f7521a9e7de9583e2ec20e_user_workflow.png"/>
+                          <pic:cNvPr id="0" name="698d97a90b145fd7681180da_user_workflow.png"/>
                           <pic:cNvPicPr/>
                         </pic:nvPicPr>
                         <pic:blipFill>
@@ -1499,44 +1363,14 @@
         <w:pStyle w:val="ListBullet"/>
       </w:pPr>
       <w:r>
-        <w:t>System performance target: Normal under expected user scale 100-1k.</w:t>
+        <w:t>Performance: Normal. Scale: &gt;100k.</w:t>
       </w:r>
       <w:r>
         <w:rPr>
           <w:i/>
         </w:rPr>
         <w:br/>
-        <w:t>Rationale: User-specified baseline.</w:t>
-      </w:r>
-    </w:p>
-    <w:p>
-      <w:pPr>
-        <w:pStyle w:val="ListBullet"/>
-      </w:pPr>
-      <w:r>
-        <w:t>Primary API operations should return within acceptable interactive latency for standard workloads.</w:t>
-      </w:r>
-      <w:r>
-        <w:rPr>
-          <w:i/>
-        </w:rPr>
-        <w:br/>
-        <w:t>Rationale: Usability and productivity.</w:t>
-      </w:r>
-    </w:p>
-    <w:p>
-      <w:pPr>
-        <w:pStyle w:val="ListBullet"/>
-      </w:pPr>
-      <w:r>
-        <w:t>Report and document generation pipelines should provide progress status and deterministic completion behavior.</w:t>
-      </w:r>
-      <w:r>
-        <w:rPr>
-          <w:i/>
-        </w:rPr>
-        <w:br/>
-        <w:t>Rationale: Operational reliability.</w:t>
+        <w:t>Rationale: User-specified.</w:t>
       </w:r>
     </w:p>
     <w:p>
@@ -1545,36 +1379,6 @@
       </w:pPr>
       <w:r>
         <w:t>6.2 Safety</w:t>
-      </w:r>
-    </w:p>
-    <w:p>
-      <w:pPr>
-        <w:pStyle w:val="ListBullet"/>
-      </w:pPr>
-      <w:r>
-        <w:t>Critical operations must validate business rules before persisting state changes.</w:t>
-      </w:r>
-      <w:r>
-        <w:rPr>
-          <w:i/>
-        </w:rPr>
-        <w:br/>
-        <w:t>Rationale: Prevent invalid transactions.</w:t>
-      </w:r>
-    </w:p>
-    <w:p>
-      <w:pPr>
-        <w:pStyle w:val="ListBullet"/>
-      </w:pPr>
-      <w:r>
-        <w:t>System should provide safe rollback/retry behavior for failed asynchronous operations.</w:t>
-      </w:r>
-      <w:r>
-        <w:rPr>
-          <w:i/>
-        </w:rPr>
-        <w:br/>
-        <w:t>Rationale: Data consistency.</w:t>
       </w:r>
     </w:p>
     <w:p>
@@ -1602,70 +1406,10 @@
     </w:p>
     <w:p>
       <w:pPr>
-        <w:pStyle w:val="ListBullet"/>
-      </w:pPr>
-      <w:r>
-        <w:t>Role-based authorization must be enforced at API and workflow layers.</w:t>
-      </w:r>
-      <w:r>
-        <w:rPr>
-          <w:i/>
-        </w:rPr>
-        <w:br/>
-        <w:t>Rationale: Access control.</w:t>
-      </w:r>
-    </w:p>
-    <w:p>
-      <w:pPr>
-        <w:pStyle w:val="ListBullet"/>
-      </w:pPr>
-      <w:r>
-        <w:t>Sensitive data should be protected in transit and at rest.</w:t>
-      </w:r>
-      <w:r>
-        <w:rPr>
-          <w:i/>
-        </w:rPr>
-        <w:br/>
-        <w:t>Rationale: Compliance and risk reduction.</w:t>
-      </w:r>
-    </w:p>
-    <w:p>
-      <w:pPr>
         <w:pStyle w:val="Heading2"/>
       </w:pPr>
       <w:r>
         <w:t>6.4 Quality</w:t>
-      </w:r>
-    </w:p>
-    <w:p>
-      <w:pPr>
-        <w:pStyle w:val="ListBullet"/>
-      </w:pPr>
-      <w:r>
-        <w:t>Maintainable module boundaries and clear service contracts.</w:t>
-      </w:r>
-      <w:r>
-        <w:rPr>
-          <w:i/>
-        </w:rPr>
-        <w:br/>
-        <w:t>Rationale: Long-term extensibility.</w:t>
-      </w:r>
-    </w:p>
-    <w:p>
-      <w:pPr>
-        <w:pStyle w:val="ListBullet"/>
-      </w:pPr>
-      <w:r>
-        <w:t>Observable runtime behavior with logs, status endpoints, and workflow events.</w:t>
-      </w:r>
-      <w:r>
-        <w:rPr>
-          <w:i/>
-        </w:rPr>
-        <w:br/>
-        <w:t>Rationale: Supportability.</w:t>
       </w:r>
     </w:p>
     <w:p>
@@ -1703,7 +1447,7 @@
             <w:r>
               <w:drawing>
                 <wp:inline xmlns:a="http://schemas.openxmlformats.org/drawingml/2006/main" xmlns:pic="http://schemas.openxmlformats.org/drawingml/2006/picture">
-                  <wp:extent cx="5303520" cy="473117"/>
+                  <wp:extent cx="5303520" cy="475980"/>
                   <wp:docPr id="11" name="Picture 11"/>
                   <wp:cNvGraphicFramePr>
                     <a:graphicFrameLocks noChangeAspect="1"/>
@@ -1712,7 +1456,7 @@
                     <a:graphicData uri="http://schemas.openxmlformats.org/drawingml/2006/picture">
                       <pic:pic>
                         <pic:nvPicPr>
-                          <pic:cNvPr id="0" name="69f7521a9e7de9583e2ec20e_security_flow.png"/>
+                          <pic:cNvPr id="0" name="698d97a90b145fd7681180da_security_flow.png"/>
                           <pic:cNvPicPr/>
                         </pic:nvPicPr>
                         <pic:blipFill>
@@ -1724,7 +1468,7 @@
                         <pic:spPr>
                           <a:xfrm>
                             <a:off x="0" y="0"/>
-                            <a:ext cx="5303520" cy="473117"/>
+                            <a:ext cx="5303520" cy="475980"/>
                           </a:xfrm>
                           <a:prstGeom prst="rect"/>
                         </pic:spPr>
@@ -1795,7 +1539,7 @@
                     <a:graphicData uri="http://schemas.openxmlformats.org/drawingml/2006/picture">
                       <pic:pic>
                         <pic:nvPicPr>
-                          <pic:cNvPr id="0" name="69f7521a9e7de9583e2ec20e_data_erd.png"/>
+                          <pic:cNvPr id="0" name="698d97a90b145fd7681180da_data_erd.png"/>
                           <pic:cNvPicPr/>
                         </pic:nvPicPr>
                         <pic:blipFill>
@@ -1852,7 +1596,7 @@
     </w:p>
     <w:p>
       <w:r>
-        <w:t>Responsive web interface with role-specific dashboards, controlled forms, and guided workflows.</w:t>
+        <w:t>Web or client UI as appropriate.</w:t>
       </w:r>
     </w:p>
     <w:tbl>
@@ -1877,7 +1621,7 @@
             <w:r>
               <w:drawing>
                 <wp:inline xmlns:a="http://schemas.openxmlformats.org/drawingml/2006/main" xmlns:pic="http://schemas.openxmlformats.org/drawingml/2006/picture">
-                  <wp:extent cx="5486400" cy="1288752"/>
+                  <wp:extent cx="5486400" cy="1167319"/>
                   <wp:docPr id="13" name="Picture 13"/>
                   <wp:cNvGraphicFramePr>
                     <a:graphicFrameLocks noChangeAspect="1"/>
@@ -1886,7 +1630,7 @@
                     <a:graphicData uri="http://schemas.openxmlformats.org/drawingml/2006/picture">
                       <pic:pic>
                         <pic:nvPicPr>
-                          <pic:cNvPr id="0" name="69f7521a9e7de9583e2ec20e_user_interfaces_diagram.png"/>
+                          <pic:cNvPr id="0" name="698d97a90b145fd7681180da_user_interfaces_diagram.png"/>
                           <pic:cNvPicPr/>
                         </pic:nvPicPr>
                         <pic:blipFill>
@@ -1898,7 +1642,7 @@
                         <pic:spPr>
                           <a:xfrm>
                             <a:off x="0" y="0"/>
-                            <a:ext cx="5486400" cy="1288752"/>
+                            <a:ext cx="5486400" cy="1167319"/>
                           </a:xfrm>
                           <a:prstGeom prst="rect"/>
                         </pic:spPr>
@@ -1935,7 +1679,7 @@
     </w:p>
     <w:p>
       <w:r>
-        <w:t>Compatible with standard workstation environments and cloud-hosted runtime infrastructure.</w:t>
+        <w:t>Standard hardware.</w:t>
       </w:r>
     </w:p>
     <w:tbl>
@@ -1960,7 +1704,7 @@
             <w:r>
               <w:drawing>
                 <wp:inline xmlns:a="http://schemas.openxmlformats.org/drawingml/2006/main" xmlns:pic="http://schemas.openxmlformats.org/drawingml/2006/picture">
-                  <wp:extent cx="5486400" cy="1288752"/>
+                  <wp:extent cx="5486400" cy="1167319"/>
                   <wp:docPr id="14" name="Picture 14"/>
                   <wp:cNvGraphicFramePr>
                     <a:graphicFrameLocks noChangeAspect="1"/>
@@ -1969,7 +1713,7 @@
                     <a:graphicData uri="http://schemas.openxmlformats.org/drawingml/2006/picture">
                       <pic:pic>
                         <pic:nvPicPr>
-                          <pic:cNvPr id="0" name="69f7521a9e7de9583e2ec20e_user_interfaces_diagram.png"/>
+                          <pic:cNvPr id="0" name="698d97a90b145fd7681180da_user_interfaces_diagram.png"/>
                           <pic:cNvPicPr/>
                         </pic:nvPicPr>
                         <pic:blipFill>
@@ -1981,7 +1725,7 @@
                         <pic:spPr>
                           <a:xfrm>
                             <a:off x="0" y="0"/>
-                            <a:ext cx="5486400" cy="1288752"/>
+                            <a:ext cx="5486400" cy="1167319"/>
                           </a:xfrm>
                           <a:prstGeom prst="rect"/>
                         </pic:spPr>
@@ -2030,7 +1774,7 @@
             <w:r>
               <w:drawing>
                 <wp:inline xmlns:a="http://schemas.openxmlformats.org/drawingml/2006/main" xmlns:pic="http://schemas.openxmlformats.org/drawingml/2006/picture">
-                  <wp:extent cx="5029200" cy="1181356"/>
+                  <wp:extent cx="5029200" cy="1070043"/>
                   <wp:docPr id="15" name="Picture 15"/>
                   <wp:cNvGraphicFramePr>
                     <a:graphicFrameLocks noChangeAspect="1"/>
@@ -2039,7 +1783,7 @@
                     <a:graphicData uri="http://schemas.openxmlformats.org/drawingml/2006/picture">
                       <pic:pic>
                         <pic:nvPicPr>
-                          <pic:cNvPr id="0" name="69f7521a9e7de9583e2ec20e_user_interfaces_diagram.png"/>
+                          <pic:cNvPr id="0" name="698d97a90b145fd7681180da_user_interfaces_diagram.png"/>
                           <pic:cNvPicPr/>
                         </pic:nvPicPr>
                         <pic:blipFill>
@@ -2051,7 +1795,7 @@
                         <pic:spPr>
                           <a:xfrm>
                             <a:off x="0" y="0"/>
-                            <a:ext cx="5029200" cy="1181356"/>
+                            <a:ext cx="5029200" cy="1070043"/>
                           </a:xfrm>
                           <a:prstGeom prst="rect"/>
                         </pic:spPr>
@@ -2080,7 +1824,7 @@
     </w:p>
     <w:p>
       <w:r>
-        <w:t>Secure HTTPS-based REST APIs with token authentication, request validation, and structured error handling.</w:t>
+        <w:t>REST/API or as required.</w:t>
       </w:r>
     </w:p>
     <w:p>
@@ -2274,7 +2018,7 @@
           </w:tcPr>
           <w:p>
             <w:r>
-              <w:t>Uses role-specific modules and dashboards relevant to assigned responsibilities.</w:t>
+              <w:t>[]</w:t>
             </w:r>
           </w:p>
         </w:tc>
@@ -2284,7 +2028,7 @@
           </w:tcPr>
           <w:p>
             <w:r>
-              <w:t>Perform domain operations, review records, and track workflow status.</w:t>
+              <w:t>N/A</w:t>
             </w:r>
           </w:p>
         </w:tc>
@@ -2294,7 +2038,7 @@
           </w:tcPr>
           <w:p>
             <w:r>
-              <w:t>Basic process knowledge and familiarity with secure web applications.</w:t>
+              <w:t>N/A</w:t>
             </w:r>
           </w:p>
         </w:tc>
@@ -2356,7 +2100,7 @@
           </w:tcPr>
           <w:p>
             <w:r>
-              <w:t>Inputs</w:t>
+              <w:t>Requirements</w:t>
             </w:r>
           </w:p>
         </w:tc>
@@ -2366,79 +2110,7 @@
           </w:tcPr>
           <w:p>
             <w:r>
-              <w:t>Authenticated user context, validated payload, and policy constraints.</w:t>
-            </w:r>
-          </w:p>
-        </w:tc>
-      </w:tr>
-      <w:tr>
-        <w:tc>
-          <w:tcPr>
-            <w:tcW w:type="dxa" w:w="4680"/>
-          </w:tcPr>
-          <w:p>
-            <w:r>
-              <w:t>Functional Specs</w:t>
-            </w:r>
-          </w:p>
-        </w:tc>
-        <w:tc>
-          <w:tcPr>
-            <w:tcW w:type="dxa" w:w="4680"/>
-          </w:tcPr>
-          <w:p>
-            <w:r>
-              <w:t>• The system shall provide a complete default feature workflow with create, validate, update, and close actions.</w:t>
-              <w:br/>
-              <w:t>• The system shall enforce role-based access and approval checkpoints for default feature operations.</w:t>
-              <w:br/>
-              <w:t>• The system shall persist all default feature transactions with timestamps and actor identifiers for traceability.</w:t>
-              <w:br/>
-              <w:t>• The system shall expose filtered views and reports for default feature to support monitoring and decision-making.</w:t>
-            </w:r>
-          </w:p>
-        </w:tc>
-      </w:tr>
-      <w:tr>
-        <w:tc>
-          <w:tcPr>
-            <w:tcW w:type="dxa" w:w="4680"/>
-          </w:tcPr>
-          <w:p>
-            <w:r>
-              <w:t>Outputs</w:t>
-            </w:r>
-          </w:p>
-        </w:tc>
-        <w:tc>
-          <w:tcPr>
-            <w:tcW w:type="dxa" w:w="4680"/>
-          </w:tcPr>
-          <w:p>
-            <w:r>
-              <w:t>Persisted transaction result, status update, and user-visible confirmation.</w:t>
-            </w:r>
-          </w:p>
-        </w:tc>
-      </w:tr>
-      <w:tr>
-        <w:tc>
-          <w:tcPr>
-            <w:tcW w:type="dxa" w:w="4680"/>
-          </w:tcPr>
-          <w:p>
-            <w:r>
-              <w:t>Acceptance Criteria</w:t>
-            </w:r>
-          </w:p>
-        </w:tc>
-        <w:tc>
-          <w:tcPr>
-            <w:tcW w:type="dxa" w:w="4680"/>
-          </w:tcPr>
-          <w:p>
-            <w:r>
-              <w:t>Operation completes successfully with validation, authorization, and audit logging.</w:t>
+              <w:t>• Support: Default Feature</w:t>
             </w:r>
           </w:p>
         </w:tc>
@@ -2496,7 +2168,7 @@
             <w:r>
               <w:drawing>
                 <wp:inline xmlns:a="http://schemas.openxmlformats.org/drawingml/2006/main" xmlns:pic="http://schemas.openxmlformats.org/drawingml/2006/picture">
-                  <wp:extent cx="5486400" cy="3301322"/>
+                  <wp:extent cx="5486400" cy="3247053"/>
                   <wp:docPr id="16" name="Picture 16"/>
                   <wp:cNvGraphicFramePr>
                     <a:graphicFrameLocks noChangeAspect="1"/>
@@ -2505,7 +2177,7 @@
                     <a:graphicData uri="http://schemas.openxmlformats.org/drawingml/2006/picture">
                       <pic:pic>
                         <pic:nvPicPr>
-                          <pic:cNvPr id="0" name="69f7521a9e7de9583e2ec20e_sequence_diagram.png"/>
+                          <pic:cNvPr id="0" name="698d97a90b145fd7681180da_sequence_diagram.png"/>
                           <pic:cNvPicPr/>
                         </pic:nvPicPr>
                         <pic:blipFill>
@@ -2517,7 +2189,7 @@
                         <pic:spPr>
                           <a:xfrm>
                             <a:off x="0" y="0"/>
-                            <a:ext cx="5486400" cy="3301322"/>
+                            <a:ext cx="5486400" cy="3247053"/>
                           </a:xfrm>
                           <a:prstGeom prst="rect"/>
                         </pic:spPr>
@@ -2588,7 +2260,7 @@
                     <a:graphicData uri="http://schemas.openxmlformats.org/drawingml/2006/picture">
                       <pic:pic>
                         <pic:nvPicPr>
-                          <pic:cNvPr id="0" name="69f7521a9e7de9583e2ec20e_state_diagram.png"/>
+                          <pic:cNvPr id="0" name="698d97a90b145fd7681180da_state_diagram.png"/>
                           <pic:cNvPicPr/>
                         </pic:nvPicPr>
                         <pic:blipFill>
@@ -2687,7 +2359,7 @@
                     <a:graphicData uri="http://schemas.openxmlformats.org/drawingml/2006/picture">
                       <pic:pic>
                         <pic:nvPicPr>
-                          <pic:cNvPr id="0" name="69f7521a9e7de9583e2ec20e_ui_local_diagram.png"/>
+                          <pic:cNvPr id="0" name="698d97a90b145fd7681180da_ui_local_diagram.png"/>
                           <pic:cNvPicPr/>
                         </pic:nvPicPr>
                         <pic:blipFill>
@@ -2739,187 +2411,11 @@
         <w:t>Appendix E: Risk Analysis</w:t>
       </w:r>
     </w:p>
-    <w:tbl>
-      <w:tblPr>
-        <w:tblStyle w:val="TableGrid"/>
-        <w:tblW w:type="auto" w:w="0"/>
-        <w:tblLook w:firstColumn="1" w:firstRow="1" w:lastColumn="0" w:lastRow="0" w:noHBand="0" w:noVBand="1" w:val="04A0"/>
-      </w:tblPr>
-      <w:tblGrid>
-        <w:gridCol w:w="2340"/>
-        <w:gridCol w:w="2340"/>
-        <w:gridCol w:w="2340"/>
-        <w:gridCol w:w="2340"/>
-      </w:tblGrid>
-      <w:tr>
-        <w:tc>
-          <w:tcPr>
-            <w:tcW w:type="dxa" w:w="2340"/>
-          </w:tcPr>
-          <w:p>
-            <w:r>
-              <w:t>Risk</w:t>
-            </w:r>
-          </w:p>
-        </w:tc>
-        <w:tc>
-          <w:tcPr>
-            <w:tcW w:type="dxa" w:w="2340"/>
-          </w:tcPr>
-          <w:p>
-            <w:r>
-              <w:t>Probability</w:t>
-            </w:r>
-          </w:p>
-        </w:tc>
-        <w:tc>
-          <w:tcPr>
-            <w:tcW w:type="dxa" w:w="2340"/>
-          </w:tcPr>
-          <w:p>
-            <w:r>
-              <w:t>Impact</w:t>
-            </w:r>
-          </w:p>
-        </w:tc>
-        <w:tc>
-          <w:tcPr>
-            <w:tcW w:type="dxa" w:w="2340"/>
-          </w:tcPr>
-          <w:p>
-            <w:r>
-              <w:t>Mitigation</w:t>
-            </w:r>
-          </w:p>
-        </w:tc>
-      </w:tr>
-      <w:tr>
-        <w:tc>
-          <w:tcPr>
-            <w:tcW w:type="dxa" w:w="2340"/>
-          </w:tcPr>
-          <w:p>
-            <w:r>
-              <w:t>Service downtime during peak business operations</w:t>
-            </w:r>
-          </w:p>
-        </w:tc>
-        <w:tc>
-          <w:tcPr>
-            <w:tcW w:type="dxa" w:w="2340"/>
-          </w:tcPr>
-          <w:p>
-            <w:r>
-              <w:t>Medium</w:t>
-            </w:r>
-          </w:p>
-        </w:tc>
-        <w:tc>
-          <w:tcPr>
-            <w:tcW w:type="dxa" w:w="2340"/>
-          </w:tcPr>
-          <w:p>
-            <w:r>
-              <w:t>High</w:t>
-            </w:r>
-          </w:p>
-        </w:tc>
-        <w:tc>
-          <w:tcPr>
-            <w:tcW w:type="dxa" w:w="2340"/>
-          </w:tcPr>
-          <w:p>
-            <w:r>
-              <w:t>Add health checks, retries, and monitored deployment pipeline.</w:t>
-            </w:r>
-          </w:p>
-        </w:tc>
-      </w:tr>
-      <w:tr>
-        <w:tc>
-          <w:tcPr>
-            <w:tcW w:type="dxa" w:w="2340"/>
-          </w:tcPr>
-          <w:p>
-            <w:r>
-              <w:t>Unauthorized access to sensitive records</w:t>
-            </w:r>
-          </w:p>
-        </w:tc>
-        <w:tc>
-          <w:tcPr>
-            <w:tcW w:type="dxa" w:w="2340"/>
-          </w:tcPr>
-          <w:p>
-            <w:r>
-              <w:t>Low</w:t>
-            </w:r>
-          </w:p>
-        </w:tc>
-        <w:tc>
-          <w:tcPr>
-            <w:tcW w:type="dxa" w:w="2340"/>
-          </w:tcPr>
-          <w:p>
-            <w:r>
-              <w:t>High</w:t>
-            </w:r>
-          </w:p>
-        </w:tc>
-        <w:tc>
-          <w:tcPr>
-            <w:tcW w:type="dxa" w:w="2340"/>
-          </w:tcPr>
-          <w:p>
-            <w:r>
-              <w:t>Enforce RBAC, strong token controls, and audit logs.</w:t>
-            </w:r>
-          </w:p>
-        </w:tc>
-      </w:tr>
-      <w:tr>
-        <w:tc>
-          <w:tcPr>
-            <w:tcW w:type="dxa" w:w="2340"/>
-          </w:tcPr>
-          <w:p>
-            <w:r>
-              <w:t>Data inconsistency across integrated modules</w:t>
-            </w:r>
-          </w:p>
-        </w:tc>
-        <w:tc>
-          <w:tcPr>
-            <w:tcW w:type="dxa" w:w="2340"/>
-          </w:tcPr>
-          <w:p>
-            <w:r>
-              <w:t>Medium</w:t>
-            </w:r>
-          </w:p>
-        </w:tc>
-        <w:tc>
-          <w:tcPr>
-            <w:tcW w:type="dxa" w:w="2340"/>
-          </w:tcPr>
-          <w:p>
-            <w:r>
-              <w:t>Medium</w:t>
-            </w:r>
-          </w:p>
-        </w:tc>
-        <w:tc>
-          <w:tcPr>
-            <w:tcW w:type="dxa" w:w="2340"/>
-          </w:tcPr>
-          <w:p>
-            <w:r>
-              <w:t>Use validation rules and transactional update patterns.</w:t>
-            </w:r>
-          </w:p>
-        </w:tc>
-      </w:tr>
-    </w:tbl>
+    <w:p>
+      <w:r>
+        <w:t>No specific risks identified.</w:t>
+      </w:r>
+    </w:p>
     <w:sectPr>
       <w:pgSz w:w="12240" w:h="15840"/>
       <w:pgMar w:top="1440" w:right="1440" w:bottom="1440" w:left="1440" w:header="720" w:footer="720" w:gutter="0"/>

</xml_diff>